<commit_message>
Updated courses and certifications
</commit_message>
<xml_diff>
--- a/assets/docs/Adrian Balderas - Resume.docx
+++ b/assets/docs/Adrian Balderas - Resume.docx
@@ -129,19 +129,13 @@
               <w:t>inventory control</w:t>
             </w:r>
             <w:r>
-              <w:t xml:space="preserve"> and following tickets of </w:t>
-            </w:r>
-            <w:r>
-              <w:t>out</w:t>
+              <w:t xml:space="preserve"> and following tickets of out</w:t>
             </w:r>
             <w:r>
               <w:t>-</w:t>
             </w:r>
             <w:r>
-              <w:t>system</w:t>
-            </w:r>
-            <w:r>
-              <w:t xml:space="preserve"> units.</w:t>
+              <w:t>system units.</w:t>
             </w:r>
           </w:p>
           <w:p/>
@@ -238,14 +232,67 @@
               <w:t>https://www.linkedin.com/in/adrian-balderas/</w:t>
             </w:r>
           </w:p>
+          <w:p/>
+          <w:p>
+            <w:r>
+              <w:t>PORTFOLIO</w:t>
+            </w:r>
+            <w:r>
+              <w:t>:</w:t>
+            </w:r>
+          </w:p>
+          <w:p>
+            <w:r>
+              <w:t>https://baldeadr.github.io</w:t>
+            </w:r>
+          </w:p>
+          <w:p/>
+          <w:p/>
+          <w:p/>
           <w:p>
             <w:pPr>
+              <w:pStyle w:val="Heading3"/>
               <w:rPr>
-                <w:rStyle w:val="Hyperlink"/>
+                <w:rFonts w:asciiTheme="minorHAnsi" w:eastAsiaTheme="minorEastAsia" w:hAnsiTheme="minorHAnsi" w:cstheme="minorBidi"/>
+                <w:color w:val="auto"/>
+                <w:szCs w:val="22"/>
               </w:rPr>
             </w:pPr>
+            <w:r>
+              <w:t>Courses &amp; Certificati</w:t>
+            </w:r>
+            <w:bookmarkStart w:id="0" w:name="_GoBack"/>
+            <w:bookmarkEnd w:id="0"/>
+            <w:r>
+              <w:t>ons</w:t>
+            </w:r>
           </w:p>
-          <w:p/>
+          <w:p>
+            <w:pPr>
+              <w:pStyle w:val="ListParagraph"/>
+              <w:numPr>
+                <w:ilvl w:val="0"/>
+                <w:numId w:val="1"/>
+              </w:numPr>
+              <w:ind w:left="165" w:hanging="180"/>
+            </w:pPr>
+            <w:r>
+              <w:t>Yellow Belt course</w:t>
+            </w:r>
+          </w:p>
+          <w:p>
+            <w:pPr>
+              <w:pStyle w:val="ListParagraph"/>
+              <w:numPr>
+                <w:ilvl w:val="0"/>
+                <w:numId w:val="1"/>
+              </w:numPr>
+              <w:ind w:left="165" w:hanging="180"/>
+            </w:pPr>
+            <w:r>
+              <w:t>Green Belt Certification (Coursing)</w:t>
+            </w:r>
+          </w:p>
         </w:tc>
         <w:tc>
           <w:tcPr>
@@ -265,6 +312,10 @@
           </w:tcPr>
           <w:sdt>
             <w:sdtPr>
+              <w:rPr>
+                <w:color w:val="B85A22" w:themeColor="accent2" w:themeShade="BF"/>
+                <w:u w:val="single"/>
+              </w:rPr>
               <w:id w:val="1049110328"/>
               <w:placeholder>
                 <w:docPart w:val="2AAA4D8634BF43759685467075CB2105"/>
@@ -273,7 +324,12 @@
               <w:showingPlcHdr/>
               <w15:appearance w15:val="hidden"/>
             </w:sdtPr>
-            <w:sdtEndPr/>
+            <w:sdtEndPr>
+              <w:rPr>
+                <w:color w:val="auto"/>
+                <w:u w:val="none"/>
+              </w:rPr>
+            </w:sdtEndPr>
             <w:sdtContent>
               <w:p>
                 <w:pPr>
@@ -788,7 +844,6 @@
                 <w:color w:val="FFFFFF" w:themeColor="background1"/>
               </w:rPr>
             </w:pPr>
-            <w:bookmarkStart w:id="0" w:name="_GoBack"/>
             <w:r>
               <w:rPr>
                 <w:noProof/>
@@ -807,13 +862,12 @@
                   <wp:cNvGraphicFramePr/>
                   <a:graphic xmlns:a="http://schemas.openxmlformats.org/drawingml/2006/main">
                     <a:graphicData uri="http://schemas.openxmlformats.org/drawingml/2006/chart">
-                      <c:chart xmlns:c="http://schemas.openxmlformats.org/drawingml/2006/chart" xmlns:r="http://schemas.openxmlformats.org/officeDocument/2006/relationships" r:id="rId9"/>
+                      <c:chart xmlns:c="http://schemas.openxmlformats.org/drawingml/2006/chart" xmlns:r="http://schemas.openxmlformats.org/officeDocument/2006/relationships" r:id="rId10"/>
                     </a:graphicData>
                   </a:graphic>
                 </wp:inline>
               </w:drawing>
             </w:r>
-            <w:bookmarkEnd w:id="0"/>
           </w:p>
         </w:tc>
       </w:tr>
@@ -826,7 +880,7 @@
       </w:pPr>
     </w:p>
     <w:sectPr>
-      <w:headerReference w:type="default" r:id="rId10"/>
+      <w:headerReference w:type="default" r:id="rId11"/>
       <w:pgSz w:w="12240" w:h="15840"/>
       <w:pgMar w:top="720" w:right="720" w:bottom="720" w:left="720" w:header="720" w:footer="720" w:gutter="0"/>
       <w:cols w:space="720"/>
@@ -951,6 +1005,127 @@
     </w:r>
   </w:p>
 </w:hdr>
+</file>
+
+<file path=word/numbering.xml><?xml version="1.0" encoding="utf-8"?>
+<w:numbering xmlns:wpc="http://schemas.microsoft.com/office/word/2010/wordprocessingCanvas" xmlns:cx="http://schemas.microsoft.com/office/drawing/2014/chartex" xmlns:cx1="http://schemas.microsoft.com/office/drawing/2015/9/8/chartex" xmlns:cx2="http://schemas.microsoft.com/office/drawing/2015/10/21/chartex" xmlns:cx3="http://schemas.microsoft.com/office/drawing/2016/5/9/chartex" xmlns:cx4="http://schemas.microsoft.com/office/drawing/2016/5/10/chartex" xmlns:cx5="http://schemas.microsoft.com/office/drawing/2016/5/11/chartex" xmlns:cx6="http://schemas.microsoft.com/office/drawing/2016/5/12/chartex" xmlns:cx7="http://schemas.microsoft.com/office/drawing/2016/5/13/chartex" xmlns:cx8="http://schemas.microsoft.com/office/drawing/2016/5/14/chartex" xmlns:mc="http://schemas.openxmlformats.org/markup-compatibility/2006" xmlns:aink="http://schemas.microsoft.com/office/drawing/2016/ink" xmlns:am3d="http://schemas.microsoft.com/office/drawing/2017/model3d" xmlns:o="urn:schemas-microsoft-com:office:office" xmlns:r="http://schemas.openxmlformats.org/officeDocument/2006/relationships" xmlns:m="http://schemas.openxmlformats.org/officeDocument/2006/math" xmlns:v="urn:schemas-microsoft-com:vml" xmlns:wp14="http://schemas.microsoft.com/office/word/2010/wordprocessingDrawing" xmlns:wp="http://schemas.openxmlformats.org/drawingml/2006/wordprocessingDrawing" xmlns:w10="urn:schemas-microsoft-com:office:word" xmlns:w="http://schemas.openxmlformats.org/wordprocessingml/2006/main" xmlns:w14="http://schemas.microsoft.com/office/word/2010/wordml" xmlns:w15="http://schemas.microsoft.com/office/word/2012/wordml" xmlns:w16cid="http://schemas.microsoft.com/office/word/2016/wordml/cid" xmlns:w16se="http://schemas.microsoft.com/office/word/2015/wordml/symex" xmlns:wpg="http://schemas.microsoft.com/office/word/2010/wordprocessingGroup" xmlns:wpi="http://schemas.microsoft.com/office/word/2010/wordprocessingInk" xmlns:wne="http://schemas.microsoft.com/office/word/2006/wordml" xmlns:wps="http://schemas.microsoft.com/office/word/2010/wordprocessingShape" mc:Ignorable="w14 w15 w16se w16cid wp14">
+  <w:abstractNum w:abstractNumId="0" w15:restartNumberingAfterBreak="0">
+    <w:nsid w:val="1B152466"/>
+    <w:multiLevelType w:val="hybridMultilevel"/>
+    <w:tmpl w:val="08726E16"/>
+    <w:lvl w:ilvl="0" w:tplc="04090001">
+      <w:start w:val="1"/>
+      <w:numFmt w:val="bullet"/>
+      <w:lvlText w:val=""/>
+      <w:lvlJc w:val="left"/>
+      <w:pPr>
+        <w:ind w:left="720" w:hanging="360"/>
+      </w:pPr>
+      <w:rPr>
+        <w:rFonts w:ascii="Symbol" w:hAnsi="Symbol" w:hint="default"/>
+      </w:rPr>
+    </w:lvl>
+    <w:lvl w:ilvl="1" w:tplc="04090003" w:tentative="1">
+      <w:start w:val="1"/>
+      <w:numFmt w:val="bullet"/>
+      <w:lvlText w:val="o"/>
+      <w:lvlJc w:val="left"/>
+      <w:pPr>
+        <w:ind w:left="1440" w:hanging="360"/>
+      </w:pPr>
+      <w:rPr>
+        <w:rFonts w:ascii="Courier New" w:hAnsi="Courier New" w:cs="Courier New" w:hint="default"/>
+      </w:rPr>
+    </w:lvl>
+    <w:lvl w:ilvl="2" w:tplc="04090005" w:tentative="1">
+      <w:start w:val="1"/>
+      <w:numFmt w:val="bullet"/>
+      <w:lvlText w:val=""/>
+      <w:lvlJc w:val="left"/>
+      <w:pPr>
+        <w:ind w:left="2160" w:hanging="360"/>
+      </w:pPr>
+      <w:rPr>
+        <w:rFonts w:ascii="Wingdings" w:hAnsi="Wingdings" w:hint="default"/>
+      </w:rPr>
+    </w:lvl>
+    <w:lvl w:ilvl="3" w:tplc="04090001" w:tentative="1">
+      <w:start w:val="1"/>
+      <w:numFmt w:val="bullet"/>
+      <w:lvlText w:val=""/>
+      <w:lvlJc w:val="left"/>
+      <w:pPr>
+        <w:ind w:left="2880" w:hanging="360"/>
+      </w:pPr>
+      <w:rPr>
+        <w:rFonts w:ascii="Symbol" w:hAnsi="Symbol" w:hint="default"/>
+      </w:rPr>
+    </w:lvl>
+    <w:lvl w:ilvl="4" w:tplc="04090003" w:tentative="1">
+      <w:start w:val="1"/>
+      <w:numFmt w:val="bullet"/>
+      <w:lvlText w:val="o"/>
+      <w:lvlJc w:val="left"/>
+      <w:pPr>
+        <w:ind w:left="3600" w:hanging="360"/>
+      </w:pPr>
+      <w:rPr>
+        <w:rFonts w:ascii="Courier New" w:hAnsi="Courier New" w:cs="Courier New" w:hint="default"/>
+      </w:rPr>
+    </w:lvl>
+    <w:lvl w:ilvl="5" w:tplc="04090005" w:tentative="1">
+      <w:start w:val="1"/>
+      <w:numFmt w:val="bullet"/>
+      <w:lvlText w:val=""/>
+      <w:lvlJc w:val="left"/>
+      <w:pPr>
+        <w:ind w:left="4320" w:hanging="360"/>
+      </w:pPr>
+      <w:rPr>
+        <w:rFonts w:ascii="Wingdings" w:hAnsi="Wingdings" w:hint="default"/>
+      </w:rPr>
+    </w:lvl>
+    <w:lvl w:ilvl="6" w:tplc="04090001" w:tentative="1">
+      <w:start w:val="1"/>
+      <w:numFmt w:val="bullet"/>
+      <w:lvlText w:val=""/>
+      <w:lvlJc w:val="left"/>
+      <w:pPr>
+        <w:ind w:left="5040" w:hanging="360"/>
+      </w:pPr>
+      <w:rPr>
+        <w:rFonts w:ascii="Symbol" w:hAnsi="Symbol" w:hint="default"/>
+      </w:rPr>
+    </w:lvl>
+    <w:lvl w:ilvl="7" w:tplc="04090003" w:tentative="1">
+      <w:start w:val="1"/>
+      <w:numFmt w:val="bullet"/>
+      <w:lvlText w:val="o"/>
+      <w:lvlJc w:val="left"/>
+      <w:pPr>
+        <w:ind w:left="5760" w:hanging="360"/>
+      </w:pPr>
+      <w:rPr>
+        <w:rFonts w:ascii="Courier New" w:hAnsi="Courier New" w:cs="Courier New" w:hint="default"/>
+      </w:rPr>
+    </w:lvl>
+    <w:lvl w:ilvl="8" w:tplc="04090005" w:tentative="1">
+      <w:start w:val="1"/>
+      <w:numFmt w:val="bullet"/>
+      <w:lvlText w:val=""/>
+      <w:lvlJc w:val="left"/>
+      <w:pPr>
+        <w:ind w:left="6480" w:hanging="360"/>
+      </w:pPr>
+      <w:rPr>
+        <w:rFonts w:ascii="Wingdings" w:hAnsi="Wingdings" w:hint="default"/>
+      </w:rPr>
+    </w:lvl>
+  </w:abstractNum>
+  <w:num w:numId="1">
+    <w:abstractNumId w:val="0"/>
+  </w:num>
+</w:numbering>
 </file>
 
 <file path=word/styles.xml><?xml version="1.0" encoding="utf-8"?>
@@ -1708,6 +1883,18 @@
       <w:sz w:val="18"/>
       <w:szCs w:val="22"/>
     </w:rPr>
+  </w:style>
+  <w:style w:type="paragraph" w:styleId="ListParagraph">
+    <w:name w:val="List Paragraph"/>
+    <w:basedOn w:val="Normal"/>
+    <w:uiPriority w:val="34"/>
+    <w:semiHidden/>
+    <w:qFormat/>
+    <w:rsid w:val="00566720"/>
+    <w:pPr>
+      <w:ind w:left="720"/>
+      <w:contextualSpacing/>
+    </w:pPr>
   </w:style>
 </w:styles>
 </file>
@@ -2727,6 +2914,34 @@
 
 <file path=word/glossary/fontTable.xml><?xml version="1.0" encoding="utf-8"?>
 <w:fonts xmlns:mc="http://schemas.openxmlformats.org/markup-compatibility/2006" xmlns:r="http://schemas.openxmlformats.org/officeDocument/2006/relationships" xmlns:w="http://schemas.openxmlformats.org/wordprocessingml/2006/main" xmlns:w14="http://schemas.microsoft.com/office/word/2010/wordml" xmlns:w15="http://schemas.microsoft.com/office/word/2012/wordml" xmlns:w16cid="http://schemas.microsoft.com/office/word/2016/wordml/cid" xmlns:w16se="http://schemas.microsoft.com/office/word/2015/wordml/symex" mc:Ignorable="w14 w15 w16se w16cid">
+  <w:font w:name="Symbol">
+    <w:panose1 w:val="05050102010706020507"/>
+    <w:charset w:val="02"/>
+    <w:family w:val="roman"/>
+    <w:pitch w:val="variable"/>
+    <w:sig w:usb0="00000000" w:usb1="10000000" w:usb2="00000000" w:usb3="00000000" w:csb0="80000000" w:csb1="00000000"/>
+  </w:font>
+  <w:font w:name="Times New Roman">
+    <w:panose1 w:val="02020603050405020304"/>
+    <w:charset w:val="00"/>
+    <w:family w:val="roman"/>
+    <w:pitch w:val="variable"/>
+    <w:sig w:usb0="E0002EFF" w:usb1="C000785B" w:usb2="00000009" w:usb3="00000000" w:csb0="000001FF" w:csb1="00000000"/>
+  </w:font>
+  <w:font w:name="Courier New">
+    <w:panose1 w:val="02070309020205020404"/>
+    <w:charset w:val="00"/>
+    <w:family w:val="modern"/>
+    <w:pitch w:val="fixed"/>
+    <w:sig w:usb0="E0002EFF" w:usb1="C0007843" w:usb2="00000009" w:usb3="00000000" w:csb0="000001FF" w:csb1="00000000"/>
+  </w:font>
+  <w:font w:name="Wingdings">
+    <w:panose1 w:val="05000000000000000000"/>
+    <w:charset w:val="02"/>
+    <w:family w:val="auto"/>
+    <w:pitch w:val="variable"/>
+    <w:sig w:usb0="00000000" w:usb1="10000000" w:usb2="00000000" w:usb3="00000000" w:csb0="80000000" w:csb1="00000000"/>
+  </w:font>
   <w:font w:name="Century Gothic">
     <w:panose1 w:val="020B0502020202020204"/>
     <w:charset w:val="00"/>
@@ -2741,13 +2956,6 @@
     <w:family w:val="swiss"/>
     <w:pitch w:val="variable"/>
     <w:sig w:usb0="E00002FF" w:usb1="6AC7FFFF" w:usb2="08000012" w:usb3="00000000" w:csb0="0002009F" w:csb1="00000000"/>
-  </w:font>
-  <w:font w:name="Times New Roman">
-    <w:panose1 w:val="02020603050405020304"/>
-    <w:charset w:val="00"/>
-    <w:family w:val="roman"/>
-    <w:pitch w:val="variable"/>
-    <w:sig w:usb0="E0002EFF" w:usb1="C000785B" w:usb2="00000009" w:usb3="00000000" w:csb0="000001FF" w:csb1="00000000"/>
   </w:font>
   <w:font w:name="Calibri">
     <w:panose1 w:val="020F0502020204030204"/>
@@ -2782,7 +2990,10 @@
   </w:compat>
   <w:rsids>
     <w:rsidRoot w:val="00BE586A"/>
+    <w:rsid w:val="000E47E5"/>
     <w:rsid w:val="00336107"/>
+    <w:rsid w:val="00581BF5"/>
+    <w:rsid w:val="00BB32B1"/>
     <w:rsid w:val="00BE586A"/>
     <w:rsid w:val="00FF7F60"/>
   </w:rsids>
@@ -3412,6 +3623,10 @@
   <w:style w:type="paragraph" w:customStyle="1" w:styleId="CAC5F368BE0040279300ACA94701EBF8">
     <w:name w:val="CAC5F368BE0040279300ACA94701EBF8"/>
     <w:rsid w:val="00BE586A"/>
+  </w:style>
+  <w:style w:type="paragraph" w:customStyle="1" w:styleId="92FE04A8F4F943ADBF27B4F19291A098">
+    <w:name w:val="92FE04A8F4F943ADBF27B4F19291A098"/>
+    <w:rsid w:val="00BB32B1"/>
   </w:style>
 </w:styles>
 </file>
@@ -4228,16 +4443,9 @@
 <file path=customXml/itemProps3.xml><?xml version="1.0" encoding="utf-8"?>
 <ds:datastoreItem xmlns:ds="http://schemas.openxmlformats.org/officeDocument/2006/customXml" ds:itemID="{DD14EC26-251D-443A-AF4F-B15D0F3B0F84}">
   <ds:schemaRefs>
-    <ds:schemaRef ds:uri="http://purl.org/dc/terms/"/>
-    <ds:schemaRef ds:uri="http://schemas.microsoft.com/office/2006/documentManagement/types"/>
-    <ds:schemaRef ds:uri="http://www.w3.org/XML/1998/namespace"/>
+    <ds:schemaRef ds:uri="http://schemas.microsoft.com/office/2006/metadata/properties"/>
     <ds:schemaRef ds:uri="http://schemas.microsoft.com/office/infopath/2007/PartnerControls"/>
-    <ds:schemaRef ds:uri="http://purl.org/dc/elements/1.1/"/>
-    <ds:schemaRef ds:uri="http://schemas.microsoft.com/office/2006/metadata/properties"/>
-    <ds:schemaRef ds:uri="http://schemas.openxmlformats.org/package/2006/metadata/core-properties"/>
-    <ds:schemaRef ds:uri="16c05727-aa75-4e4a-9b5f-8a80a1165891"/>
     <ds:schemaRef ds:uri="71af3243-3dd4-4a8d-8c0d-dd76da1f02a5"/>
-    <ds:schemaRef ds:uri="http://purl.org/dc/dcmitype/"/>
   </ds:schemaRefs>
 </ds:datastoreItem>
 </file>
</xml_diff>